<commit_message>
Refactor code structure and remove redundant sections for improved readability and maintainability
</commit_message>
<xml_diff>
--- a/res/Resumes/Vigneshwar_S_Frontend_Developer.docx
+++ b/res/Resumes/Vigneshwar_S_Frontend_Developer.docx
@@ -7,7 +7,7 @@
         <w:pBdr>
           <w:bottom w:val="single" w:sz="6" w:space="1" w:color="000000"/>
         </w:pBdr>
-        <w:spacing w:after="0"/>
+        <w:spacing w:after="0" w:line="240" w:lineRule="auto"/>
         <w:rPr>
           <w:rFonts w:ascii="Garamond" w:eastAsia="Times New Roman" w:hAnsi="Garamond" w:cs="Times New Roman"/>
           <w:b/>
@@ -51,31 +51,37 @@
         <w:spacing w:after="0"/>
         <w:rPr>
           <w:rFonts w:ascii="Garamond" w:eastAsia="Times New Roman" w:hAnsi="Garamond" w:cs="Times New Roman"/>
-          <w:color w:val="000000"/>
-          <w:sz w:val="28"/>
-          <w:szCs w:val="28"/>
-          <w:lang w:val="en-IN" w:eastAsia="en-IN"/>
-        </w:rPr>
-      </w:pPr>
-      <w:r>
-        <w:rPr>
-          <w:rFonts w:ascii="Garamond" w:eastAsia="Times New Roman" w:hAnsi="Garamond" w:cs="Times New Roman"/>
-          <w:color w:val="000000"/>
-          <w:sz w:val="28"/>
-          <w:szCs w:val="28"/>
-          <w:lang w:val="en-IN" w:eastAsia="en-IN"/>
-        </w:rPr>
-        <w:t>vigneshwar.s1996@gmail.com | +9</w:t>
-      </w:r>
-      <w:r>
-        <w:rPr>
-          <w:rFonts w:ascii="Garamond" w:eastAsia="Times New Roman" w:hAnsi="Garamond" w:cs="Times New Roman"/>
-          <w:color w:val="000000"/>
-          <w:sz w:val="28"/>
-          <w:szCs w:val="28"/>
-          <w:lang w:val="en-IN" w:eastAsia="en-IN"/>
-        </w:rPr>
-        <w:t>1 9500013901 | Chennai, India</w:t>
+          <w:b/>
+          <w:bCs/>
+          <w:color w:val="000000"/>
+          <w:sz w:val="32"/>
+          <w:szCs w:val="32"/>
+          <w:lang w:val="en-IN" w:eastAsia="en-IN"/>
+        </w:rPr>
+      </w:pPr>
+      <w:r>
+        <w:rPr>
+          <w:rFonts w:ascii="Garamond" w:eastAsia="Times New Roman" w:hAnsi="Garamond" w:cs="Times New Roman"/>
+          <w:b/>
+          <w:bCs/>
+          <w:color w:val="000000"/>
+          <w:sz w:val="32"/>
+          <w:szCs w:val="32"/>
+          <w:lang w:val="en-IN" w:eastAsia="en-IN"/>
+        </w:rPr>
+        <w:t xml:space="preserve">Frontend </w:t>
+      </w:r>
+      <w:r>
+        <w:rPr>
+          <w:rFonts w:ascii="Garamond" w:eastAsia="Times New Roman" w:hAnsi="Garamond" w:cs="Times New Roman"/>
+          <w:b/>
+          <w:bCs/>
+          <w:color w:val="000000"/>
+          <w:sz w:val="32"/>
+          <w:szCs w:val="32"/>
+          <w:lang w:val="en-IN" w:eastAsia="en-IN"/>
+        </w:rPr>
+        <w:t>Developer</w:t>
       </w:r>
     </w:p>
     <w:p>
@@ -86,9 +92,46 @@
         <w:spacing w:after="0"/>
         <w:rPr>
           <w:rFonts w:ascii="Garamond" w:eastAsia="Times New Roman" w:hAnsi="Garamond" w:cs="Times New Roman"/>
+          <w:color w:val="000000"/>
+          <w:sz w:val="28"/>
+          <w:szCs w:val="28"/>
+          <w:lang w:val="en-IN" w:eastAsia="en-IN"/>
+        </w:rPr>
+      </w:pPr>
+      <w:r>
+        <w:rPr>
+          <w:rFonts w:ascii="Garamond" w:eastAsia="Times New Roman" w:hAnsi="Garamond" w:cs="Times New Roman"/>
+          <w:color w:val="000000"/>
+          <w:sz w:val="28"/>
+          <w:szCs w:val="28"/>
+          <w:lang w:val="en-IN" w:eastAsia="en-IN"/>
+        </w:rPr>
+        <w:t>vigneshwar.s1996@gmail.com | +9</w:t>
+      </w:r>
+      <w:r>
+        <w:rPr>
+          <w:rFonts w:ascii="Garamond" w:eastAsia="Times New Roman" w:hAnsi="Garamond" w:cs="Times New Roman"/>
+          <w:color w:val="000000"/>
+          <w:sz w:val="28"/>
+          <w:szCs w:val="28"/>
+          <w:lang w:val="en-IN" w:eastAsia="en-IN"/>
+        </w:rPr>
+        <w:t>1 9500013901 | Chennai, India</w:t>
+      </w:r>
+    </w:p>
+    <w:p>
+      <w:pPr>
+        <w:pBdr>
+          <w:bottom w:val="single" w:sz="6" w:space="1" w:color="000000"/>
+        </w:pBdr>
+        <w:spacing w:after="0"/>
+        <w:rPr>
+          <w:rStyle w:val="Hyperlink"/>
+          <w:rFonts w:ascii="Garamond" w:eastAsia="Times New Roman" w:hAnsi="Garamond" w:cs="Times New Roman"/>
           <w:color w:val="0F243E" w:themeColor="text2" w:themeShade="80"/>
           <w:sz w:val="28"/>
           <w:szCs w:val="28"/>
+          <w:u w:val="none"/>
           <w:lang w:val="en-IN" w:eastAsia="en-IN"/>
         </w:rPr>
       </w:pPr>
@@ -263,24 +306,106 @@
     </w:p>
     <w:p>
       <w:pPr>
-        <w:spacing w:after="3"/>
-        <w:textAlignment w:val="baseline"/>
-        <w:rPr>
-          <w:rFonts w:ascii="Garamond" w:eastAsia="Times New Roman" w:hAnsi="Garamond" w:cs="Times New Roman"/>
-          <w:sz w:val="20"/>
-          <w:szCs w:val="20"/>
-          <w:lang w:val="en-IN" w:eastAsia="en-IN"/>
-        </w:rPr>
-      </w:pPr>
-    </w:p>
-    <w:p>
-      <w:pPr>
         <w:pBdr>
           <w:bottom w:val="single" w:sz="6" w:space="1" w:color="000000"/>
         </w:pBdr>
         <w:spacing w:after="0"/>
         <w:rPr>
           <w:rFonts w:ascii="Garamond" w:eastAsia="Times New Roman" w:hAnsi="Garamond" w:cs="Times New Roman"/>
+          <w:i/>
+          <w:color w:val="111111"/>
+          <w:lang w:val="en-IN" w:eastAsia="en-IN"/>
+        </w:rPr>
+      </w:pPr>
+      <w:r>
+        <w:rPr>
+          <w:rFonts w:ascii="Garamond" w:eastAsia="Times New Roman" w:hAnsi="Garamond" w:cs="Times New Roman"/>
+          <w:i/>
+          <w:color w:val="111111"/>
+          <w:lang w:val="en-IN" w:eastAsia="en-IN"/>
+        </w:rPr>
+        <w:t>Open to</w:t>
+      </w:r>
+      <w:r>
+        <w:rPr>
+          <w:rFonts w:ascii="Garamond" w:eastAsia="Times New Roman" w:hAnsi="Garamond" w:cs="Times New Roman"/>
+          <w:i/>
+          <w:color w:val="111111"/>
+          <w:lang w:val="en-IN" w:eastAsia="en-IN"/>
+          <w14:textFill>
+            <w14:solidFill>
+              <w14:srgbClr w14:val="111111">
+                <w14:lumMod w14:val="50000"/>
+              </w14:srgbClr>
+            </w14:solidFill>
+          </w14:textFill>
+        </w:rPr>
+        <w:t xml:space="preserve"> </w:t>
+      </w:r>
+      <w:r>
+        <w:rPr>
+          <w:rFonts w:ascii="Garamond" w:eastAsia="Times New Roman" w:hAnsi="Garamond" w:cs="Times New Roman"/>
+          <w:i/>
+          <w:color w:val="111111"/>
+          <w:lang w:val="en-IN" w:eastAsia="en-IN"/>
+        </w:rPr>
+        <w:t>International</w:t>
+      </w:r>
+      <w:r>
+        <w:rPr>
+          <w:rFonts w:ascii="Garamond" w:eastAsia="Times New Roman" w:hAnsi="Garamond" w:cs="Times New Roman"/>
+          <w:i/>
+          <w:color w:val="111111"/>
+          <w:lang w:val="en-IN" w:eastAsia="en-IN"/>
+        </w:rPr>
+        <w:t xml:space="preserve"> relocation </w:t>
+      </w:r>
+      <w:r>
+        <w:rPr>
+          <w:rFonts w:ascii="Garamond" w:eastAsia="Times New Roman" w:hAnsi="Garamond" w:cs="Times New Roman"/>
+          <w:i/>
+          <w:color w:val="111111"/>
+          <w:lang w:val="en-IN" w:eastAsia="en-IN"/>
+          <w14:textFill>
+            <w14:solidFill>
+              <w14:srgbClr w14:val="111111">
+                <w14:lumMod w14:val="50000"/>
+              </w14:srgbClr>
+            </w14:solidFill>
+          </w14:textFill>
+        </w:rPr>
+        <w:t xml:space="preserve">| Visa </w:t>
+      </w:r>
+      <w:r>
+        <w:rPr>
+          <w:rFonts w:ascii="Garamond" w:eastAsia="Times New Roman" w:hAnsi="Garamond" w:cs="Times New Roman"/>
+          <w:i/>
+          <w:color w:val="111111"/>
+          <w:lang w:val="en-IN" w:eastAsia="en-IN"/>
+        </w:rPr>
+        <w:t>Sponsorship Required</w:t>
+      </w:r>
+    </w:p>
+    <w:p>
+      <w:pPr>
+        <w:spacing w:after="3"/>
+        <w:textAlignment w:val="baseline"/>
+        <w:rPr>
+          <w:rFonts w:ascii="Garamond" w:eastAsia="Times New Roman" w:hAnsi="Garamond" w:cs="Times New Roman"/>
+          <w:sz w:val="20"/>
+          <w:szCs w:val="20"/>
+          <w:lang w:val="en-IN" w:eastAsia="en-IN"/>
+        </w:rPr>
+      </w:pPr>
+    </w:p>
+    <w:p>
+      <w:pPr>
+        <w:pBdr>
+          <w:bottom w:val="single" w:sz="6" w:space="1" w:color="000000"/>
+        </w:pBdr>
+        <w:spacing w:after="0"/>
+        <w:rPr>
+          <w:rFonts w:ascii="Garamond" w:eastAsia="Times New Roman" w:hAnsi="Garamond" w:cs="Times New Roman"/>
           <w:sz w:val="20"/>
           <w:szCs w:val="20"/>
           <w:lang w:val="en-IN" w:eastAsia="en-IN"/>
@@ -315,6 +440,9 @@
         <w:spacing w:after="0"/>
         <w:rPr>
           <w:rFonts w:ascii="Garamond" w:eastAsia="Times New Roman" w:hAnsi="Garamond" w:cs="Times New Roman"/>
+          <w:i/>
+          <w:iCs/>
+          <w:color w:val="000000"/>
           <w:sz w:val="20"/>
           <w:szCs w:val="20"/>
           <w:lang w:val="en-IN" w:eastAsia="en-IN"/>
@@ -335,9 +463,81 @@
       <w:r>
         <w:rPr>
           <w:rFonts w:ascii="Garamond" w:eastAsia="Times New Roman" w:hAnsi="Garamond" w:cs="Times New Roman"/>
+          <w:i/>
+          <w:iCs/>
+          <w:color w:val="808080" w:themeColor="background1" w:themeShade="80"/>
+          <w:sz w:val="20"/>
+          <w:szCs w:val="20"/>
+          <w:lang w:val="en-IN" w:eastAsia="en-IN"/>
+        </w:rPr>
+        <w:tab/>
+      </w:r>
+      <w:r>
+        <w:rPr>
+          <w:rFonts w:ascii="Garamond" w:eastAsia="Times New Roman" w:hAnsi="Garamond" w:cs="Times New Roman"/>
+          <w:i/>
+          <w:iCs/>
+          <w:color w:val="808080" w:themeColor="background1" w:themeShade="80"/>
+          <w:sz w:val="20"/>
+          <w:szCs w:val="20"/>
+          <w:lang w:val="en-IN" w:eastAsia="en-IN"/>
+        </w:rPr>
+        <w:tab/>
+      </w:r>
+      <w:r>
+        <w:rPr>
+          <w:rFonts w:ascii="Garamond" w:eastAsia="Times New Roman" w:hAnsi="Garamond" w:cs="Times New Roman"/>
+          <w:i/>
+          <w:iCs/>
+          <w:color w:val="808080" w:themeColor="background1" w:themeShade="80"/>
+          <w:sz w:val="20"/>
+          <w:szCs w:val="20"/>
+          <w:lang w:val="en-IN" w:eastAsia="en-IN"/>
+        </w:rPr>
+        <w:tab/>
+      </w:r>
+      <w:r>
+        <w:rPr>
+          <w:rFonts w:ascii="Garamond" w:eastAsia="Times New Roman" w:hAnsi="Garamond" w:cs="Times New Roman"/>
+          <w:i/>
+          <w:iCs/>
+          <w:color w:val="808080" w:themeColor="background1" w:themeShade="80"/>
+          <w:sz w:val="20"/>
+          <w:szCs w:val="20"/>
+          <w:lang w:val="en-IN" w:eastAsia="en-IN"/>
+        </w:rPr>
+        <w:tab/>
+      </w:r>
+      <w:r>
+        <w:rPr>
+          <w:rFonts w:ascii="Garamond" w:eastAsia="Times New Roman" w:hAnsi="Garamond" w:cs="Times New Roman"/>
+          <w:i/>
+          <w:iCs/>
+          <w:color w:val="808080" w:themeColor="background1" w:themeShade="80"/>
+          <w:sz w:val="20"/>
+          <w:szCs w:val="20"/>
+          <w:lang w:val="en-IN" w:eastAsia="en-IN"/>
+        </w:rPr>
+        <w:tab/>
+      </w:r>
+      <w:r>
+        <w:rPr>
+          <w:rFonts w:ascii="Garamond" w:eastAsia="Times New Roman" w:hAnsi="Garamond" w:cs="Times New Roman"/>
+          <w:i/>
+          <w:iCs/>
+          <w:color w:val="808080" w:themeColor="background1" w:themeShade="80"/>
+          <w:sz w:val="20"/>
+          <w:szCs w:val="20"/>
+          <w:lang w:val="en-IN" w:eastAsia="en-IN"/>
+        </w:rPr>
+        <w:tab/>
+      </w:r>
+      <w:r>
+        <w:rPr>
+          <w:rFonts w:ascii="Garamond" w:eastAsia="Times New Roman" w:hAnsi="Garamond" w:cs="Times New Roman"/>
           <w:b/>
           <w:bCs/>
-          <w:color w:val="000000"/>
+          <w:color w:val="808080" w:themeColor="background1" w:themeShade="80"/>
           <w:sz w:val="20"/>
           <w:szCs w:val="20"/>
           <w:lang w:val="en-IN" w:eastAsia="en-IN"/>
@@ -391,6 +591,7 @@
           <w:lang w:val="en-IN" w:eastAsia="en-IN"/>
         </w:rPr>
         <w:tab/>
+        <w:t xml:space="preserve">             Feb. 2020 </w:t>
       </w:r>
       <w:r>
         <w:rPr>
@@ -402,175 +603,6 @@
           <w:szCs w:val="20"/>
           <w:lang w:val="en-IN" w:eastAsia="en-IN"/>
         </w:rPr>
-        <w:tab/>
-      </w:r>
-      <w:r>
-        <w:rPr>
-          <w:rFonts w:ascii="Garamond" w:eastAsia="Times New Roman" w:hAnsi="Garamond" w:cs="Times New Roman"/>
-          <w:b/>
-          <w:bCs/>
-          <w:color w:val="000000"/>
-          <w:sz w:val="20"/>
-          <w:szCs w:val="20"/>
-          <w:lang w:val="en-IN" w:eastAsia="en-IN"/>
-        </w:rPr>
-        <w:tab/>
-      </w:r>
-      <w:r>
-        <w:rPr>
-          <w:rFonts w:ascii="Garamond" w:eastAsia="Times New Roman" w:hAnsi="Garamond" w:cs="Times New Roman"/>
-          <w:b/>
-          <w:bCs/>
-          <w:color w:val="000000"/>
-          <w:sz w:val="20"/>
-          <w:szCs w:val="20"/>
-          <w:lang w:val="en-IN" w:eastAsia="en-IN"/>
-        </w:rPr>
-        <w:tab/>
-      </w:r>
-      <w:r>
-        <w:rPr>
-          <w:rFonts w:ascii="Garamond" w:eastAsia="Times New Roman" w:hAnsi="Garamond" w:cs="Times New Roman"/>
-          <w:b/>
-          <w:bCs/>
-          <w:color w:val="000000"/>
-          <w:sz w:val="20"/>
-          <w:szCs w:val="20"/>
-          <w:lang w:val="en-IN" w:eastAsia="en-IN"/>
-        </w:rPr>
-        <w:tab/>
-      </w:r>
-      <w:r>
-        <w:rPr>
-          <w:rFonts w:ascii="Garamond" w:eastAsia="Times New Roman" w:hAnsi="Garamond" w:cs="Times New Roman"/>
-          <w:b/>
-          <w:bCs/>
-          <w:color w:val="000000"/>
-          <w:sz w:val="20"/>
-          <w:szCs w:val="20"/>
-          <w:lang w:val="en-IN" w:eastAsia="en-IN"/>
-        </w:rPr>
-        <w:tab/>
-        <w:t xml:space="preserve"> </w:t>
-      </w:r>
-      <w:r>
-        <w:rPr>
-          <w:rFonts w:ascii="Garamond" w:eastAsia="Times New Roman" w:hAnsi="Garamond" w:cs="Times New Roman"/>
-          <w:b/>
-          <w:bCs/>
-          <w:color w:val="000000"/>
-          <w:sz w:val="20"/>
-          <w:szCs w:val="20"/>
-          <w:lang w:val="en-IN" w:eastAsia="en-IN"/>
-        </w:rPr>
-        <w:tab/>
-      </w:r>
-      <w:r>
-        <w:rPr>
-          <w:rFonts w:ascii="Garamond" w:eastAsia="Times New Roman" w:hAnsi="Garamond" w:cs="Times New Roman"/>
-          <w:b/>
-          <w:bCs/>
-          <w:color w:val="000000"/>
-          <w:sz w:val="20"/>
-          <w:szCs w:val="20"/>
-          <w:lang w:val="en-IN" w:eastAsia="en-IN"/>
-        </w:rPr>
-        <w:t xml:space="preserve">    </w:t>
-      </w:r>
-      <w:r>
-        <w:rPr>
-          <w:rFonts w:ascii="Garamond" w:eastAsia="Times New Roman" w:hAnsi="Garamond" w:cs="Times New Roman"/>
-          <w:b/>
-          <w:bCs/>
-          <w:color w:val="000000"/>
-          <w:sz w:val="20"/>
-          <w:szCs w:val="20"/>
-          <w:lang w:val="en-IN" w:eastAsia="en-IN"/>
-        </w:rPr>
-        <w:t xml:space="preserve"> </w:t>
-      </w:r>
-      <w:r>
-        <w:rPr>
-          <w:rFonts w:ascii="Garamond" w:eastAsia="Times New Roman" w:hAnsi="Garamond" w:cs="Times New Roman"/>
-          <w:b/>
-          <w:bCs/>
-          <w:color w:val="000000"/>
-          <w:sz w:val="20"/>
-          <w:szCs w:val="20"/>
-          <w:lang w:val="en-IN" w:eastAsia="en-IN"/>
-        </w:rPr>
-        <w:t xml:space="preserve">      </w:t>
-      </w:r>
-      <w:r>
-        <w:rPr>
-          <w:rFonts w:ascii="Garamond" w:eastAsia="Times New Roman" w:hAnsi="Garamond" w:cs="Times New Roman"/>
-          <w:b/>
-          <w:bCs/>
-          <w:color w:val="000000"/>
-          <w:sz w:val="20"/>
-          <w:szCs w:val="20"/>
-          <w:lang w:val="en-IN" w:eastAsia="en-IN"/>
-        </w:rPr>
-        <w:t xml:space="preserve"> </w:t>
-      </w:r>
-      <w:r>
-        <w:rPr>
-          <w:rFonts w:ascii="Garamond" w:eastAsia="Times New Roman" w:hAnsi="Garamond" w:cs="Times New Roman"/>
-          <w:b/>
-          <w:bCs/>
-          <w:color w:val="000000"/>
-          <w:sz w:val="20"/>
-          <w:szCs w:val="20"/>
-          <w:lang w:val="en-IN" w:eastAsia="en-IN"/>
-        </w:rPr>
-        <w:t xml:space="preserve"> </w:t>
-      </w:r>
-      <w:r>
-        <w:rPr>
-          <w:rFonts w:ascii="Garamond" w:eastAsia="Times New Roman" w:hAnsi="Garamond" w:cs="Times New Roman"/>
-          <w:b/>
-          <w:bCs/>
-          <w:color w:val="000000"/>
-          <w:sz w:val="20"/>
-          <w:szCs w:val="20"/>
-          <w:lang w:val="en-IN" w:eastAsia="en-IN"/>
-        </w:rPr>
-        <w:t>F</w:t>
-      </w:r>
-      <w:r>
-        <w:rPr>
-          <w:rFonts w:ascii="Garamond" w:eastAsia="Times New Roman" w:hAnsi="Garamond" w:cs="Times New Roman"/>
-          <w:b/>
-          <w:bCs/>
-          <w:color w:val="000000"/>
-          <w:sz w:val="20"/>
-          <w:szCs w:val="20"/>
-          <w:lang w:val="en-IN" w:eastAsia="en-IN"/>
-        </w:rPr>
-        <w:t xml:space="preserve">eb. </w:t>
-      </w:r>
-      <w:r>
-        <w:rPr>
-          <w:rFonts w:ascii="Garamond" w:eastAsia="Times New Roman" w:hAnsi="Garamond" w:cs="Times New Roman"/>
-          <w:b/>
-          <w:bCs/>
-          <w:color w:val="000000"/>
-          <w:sz w:val="20"/>
-          <w:szCs w:val="20"/>
-          <w:lang w:val="en-IN" w:eastAsia="en-IN"/>
-        </w:rPr>
-        <w:t xml:space="preserve">2020 </w:t>
-      </w:r>
-      <w:r>
-        <w:rPr>
-          <w:rFonts w:ascii="Garamond" w:eastAsia="Times New Roman" w:hAnsi="Garamond" w:cs="Times New Roman"/>
-          <w:b/>
-          <w:bCs/>
-          <w:color w:val="000000"/>
-          <w:sz w:val="20"/>
-          <w:szCs w:val="20"/>
-          <w:lang w:val="en-IN" w:eastAsia="en-IN"/>
-        </w:rPr>
         <w:t>– Present</w:t>
       </w:r>
     </w:p>
@@ -606,7 +638,7 @@
           <w:szCs w:val="20"/>
           <w:lang w:val="en-IN" w:eastAsia="en-IN"/>
         </w:rPr>
-        <w:tab/>
+        <w:t xml:space="preserve"> (Frontend)</w:t>
       </w:r>
       <w:r>
         <w:rPr>
@@ -618,7 +650,7 @@
           <w:szCs w:val="20"/>
           <w:lang w:val="en-IN" w:eastAsia="en-IN"/>
         </w:rPr>
-        <w:t xml:space="preserve">          </w:t>
+        <w:tab/>
       </w:r>
       <w:r>
         <w:rPr>
@@ -630,7 +662,7 @@
           <w:szCs w:val="20"/>
           <w:lang w:val="en-IN" w:eastAsia="en-IN"/>
         </w:rPr>
-        <w:tab/>
+        <w:t xml:space="preserve">          </w:t>
       </w:r>
       <w:r>
         <w:rPr>
@@ -642,7 +674,7 @@
           <w:szCs w:val="20"/>
           <w:lang w:val="en-IN" w:eastAsia="en-IN"/>
         </w:rPr>
-        <w:t xml:space="preserve">        </w:t>
+        <w:tab/>
       </w:r>
       <w:r>
         <w:rPr>
@@ -654,7 +686,7 @@
           <w:szCs w:val="20"/>
           <w:lang w:val="en-IN" w:eastAsia="en-IN"/>
         </w:rPr>
-        <w:tab/>
+        <w:t xml:space="preserve">        </w:t>
       </w:r>
       <w:r>
         <w:rPr>
@@ -666,7 +698,7 @@
           <w:szCs w:val="20"/>
           <w:lang w:val="en-IN" w:eastAsia="en-IN"/>
         </w:rPr>
-        <w:t xml:space="preserve">                    </w:t>
+        <w:tab/>
       </w:r>
       <w:r>
         <w:rPr>
@@ -678,7 +710,7 @@
           <w:szCs w:val="20"/>
           <w:lang w:val="en-IN" w:eastAsia="en-IN"/>
         </w:rPr>
-        <w:tab/>
+        <w:t xml:space="preserve">                    </w:t>
       </w:r>
       <w:r>
         <w:rPr>
@@ -690,7 +722,7 @@
           <w:szCs w:val="20"/>
           <w:lang w:val="en-IN" w:eastAsia="en-IN"/>
         </w:rPr>
-        <w:t xml:space="preserve">                                </w:t>
+        <w:tab/>
       </w:r>
       <w:r>
         <w:rPr>
@@ -702,7 +734,7 @@
           <w:szCs w:val="20"/>
           <w:lang w:val="en-IN" w:eastAsia="en-IN"/>
         </w:rPr>
-        <w:tab/>
+        <w:t xml:space="preserve">                                </w:t>
       </w:r>
       <w:r>
         <w:rPr>
@@ -714,7 +746,7 @@
           <w:szCs w:val="20"/>
           <w:lang w:val="en-IN" w:eastAsia="en-IN"/>
         </w:rPr>
-        <w:t xml:space="preserve">        </w:t>
+        <w:tab/>
       </w:r>
       <w:r>
         <w:rPr>
@@ -726,7 +758,7 @@
           <w:szCs w:val="20"/>
           <w:lang w:val="en-IN" w:eastAsia="en-IN"/>
         </w:rPr>
-        <w:tab/>
+        <w:t xml:space="preserve">        </w:t>
       </w:r>
       <w:r>
         <w:rPr>
@@ -738,7 +770,7 @@
           <w:szCs w:val="20"/>
           <w:lang w:val="en-IN" w:eastAsia="en-IN"/>
         </w:rPr>
-        <w:t xml:space="preserve">        </w:t>
+        <w:tab/>
       </w:r>
       <w:r>
         <w:rPr>
@@ -750,7 +782,7 @@
           <w:szCs w:val="20"/>
           <w:lang w:val="en-IN" w:eastAsia="en-IN"/>
         </w:rPr>
-        <w:tab/>
+        <w:t xml:space="preserve">        </w:t>
       </w:r>
       <w:r>
         <w:rPr>
@@ -762,7 +794,7 @@
           <w:szCs w:val="20"/>
           <w:lang w:val="en-IN" w:eastAsia="en-IN"/>
         </w:rPr>
-        <w:t xml:space="preserve"> </w:t>
+        <w:tab/>
       </w:r>
       <w:r>
         <w:rPr>
@@ -774,7 +806,7 @@
           <w:szCs w:val="20"/>
           <w:lang w:val="en-IN" w:eastAsia="en-IN"/>
         </w:rPr>
-        <w:tab/>
+        <w:t xml:space="preserve"> </w:t>
       </w:r>
       <w:r>
         <w:rPr>
@@ -786,7 +818,7 @@
           <w:szCs w:val="20"/>
           <w:lang w:val="en-IN" w:eastAsia="en-IN"/>
         </w:rPr>
-        <w:t xml:space="preserve">   </w:t>
+        <w:tab/>
       </w:r>
       <w:r>
         <w:rPr>
@@ -798,7 +830,7 @@
           <w:szCs w:val="20"/>
           <w:lang w:val="en-IN" w:eastAsia="en-IN"/>
         </w:rPr>
-        <w:tab/>
+        <w:t xml:space="preserve">   </w:t>
       </w:r>
       <w:r>
         <w:rPr>
@@ -810,7 +842,7 @@
           <w:szCs w:val="20"/>
           <w:lang w:val="en-IN" w:eastAsia="en-IN"/>
         </w:rPr>
-        <w:t xml:space="preserve">        </w:t>
+        <w:tab/>
       </w:r>
       <w:r>
         <w:rPr>
@@ -822,7 +854,7 @@
           <w:szCs w:val="20"/>
           <w:lang w:val="en-IN" w:eastAsia="en-IN"/>
         </w:rPr>
-        <w:tab/>
+        <w:t xml:space="preserve">          </w:t>
       </w:r>
       <w:r>
         <w:rPr>
@@ -834,7 +866,7 @@
           <w:szCs w:val="20"/>
           <w:lang w:val="en-IN" w:eastAsia="en-IN"/>
         </w:rPr>
-        <w:t> </w:t>
+        <w:t>Chennai,</w:t>
       </w:r>
       <w:r>
         <w:rPr>
@@ -846,7 +878,7 @@
           <w:szCs w:val="20"/>
           <w:lang w:val="en-IN" w:eastAsia="en-IN"/>
         </w:rPr>
-        <w:t xml:space="preserve">    </w:t>
+        <w:t xml:space="preserve"> </w:t>
       </w:r>
       <w:r>
         <w:rPr>
@@ -858,60 +890,43 @@
           <w:szCs w:val="20"/>
           <w:lang w:val="en-IN" w:eastAsia="en-IN"/>
         </w:rPr>
-        <w:t xml:space="preserve">    </w:t>
-      </w:r>
-      <w:r>
-        <w:rPr>
-          <w:rFonts w:ascii="Garamond" w:eastAsia="Times New Roman" w:hAnsi="Garamond" w:cs="Times New Roman"/>
-          <w:i/>
-          <w:iCs/>
-          <w:color w:val="000000"/>
-          <w:sz w:val="20"/>
-          <w:szCs w:val="20"/>
-          <w:lang w:val="en-IN" w:eastAsia="en-IN"/>
-        </w:rPr>
-        <w:t xml:space="preserve"> </w:t>
-      </w:r>
-      <w:r>
-        <w:rPr>
-          <w:rFonts w:ascii="Garamond" w:eastAsia="Times New Roman" w:hAnsi="Garamond" w:cs="Times New Roman"/>
-          <w:i/>
-          <w:iCs/>
-          <w:color w:val="000000"/>
-          <w:sz w:val="20"/>
-          <w:szCs w:val="20"/>
-          <w:lang w:val="en-IN" w:eastAsia="en-IN"/>
-        </w:rPr>
-        <w:t xml:space="preserve"> </w:t>
-      </w:r>
-      <w:proofErr w:type="spellStart"/>
-      <w:r>
-        <w:rPr>
-          <w:rFonts w:ascii="Garamond" w:eastAsia="Times New Roman" w:hAnsi="Garamond" w:cs="Times New Roman"/>
-          <w:i/>
-          <w:iCs/>
-          <w:color w:val="000000"/>
-          <w:sz w:val="20"/>
-          <w:szCs w:val="20"/>
-          <w:lang w:val="en-IN" w:eastAsia="en-IN"/>
-        </w:rPr>
-        <w:t>Chennai</w:t>
-      </w:r>
-      <w:proofErr w:type="gramStart"/>
-      <w:r>
-        <w:rPr>
-          <w:rFonts w:ascii="Garamond" w:eastAsia="Times New Roman" w:hAnsi="Garamond" w:cs="Times New Roman"/>
-          <w:i/>
-          <w:iCs/>
-          <w:color w:val="000000"/>
-          <w:sz w:val="20"/>
-          <w:szCs w:val="20"/>
-          <w:lang w:val="en-IN" w:eastAsia="en-IN"/>
-        </w:rPr>
-        <w:t>,India</w:t>
-      </w:r>
-      <w:proofErr w:type="spellEnd"/>
-      <w:proofErr w:type="gramEnd"/>
+        <w:t>India</w:t>
+      </w:r>
+    </w:p>
+    <w:p>
+      <w:pPr>
+        <w:pStyle w:val="ListParagraph"/>
+        <w:spacing w:after="0"/>
+        <w:ind w:left="0"/>
+        <w:textAlignment w:val="baseline"/>
+        <w:rPr>
+          <w:rFonts w:ascii="Garamond" w:eastAsia="Times New Roman" w:hAnsi="Garamond" w:cs="Times New Roman"/>
+          <w:color w:val="000000"/>
+          <w:sz w:val="20"/>
+          <w:szCs w:val="20"/>
+          <w:lang w:val="en-IN" w:eastAsia="en-IN"/>
+        </w:rPr>
+      </w:pPr>
+      <w:r>
+        <w:rPr>
+          <w:rFonts w:ascii="Garamond" w:eastAsia="Times New Roman" w:hAnsi="Garamond" w:cs="Times New Roman"/>
+          <w:sz w:val="20"/>
+          <w:szCs w:val="20"/>
+          <w:lang w:val="en-IN" w:eastAsia="en-IN"/>
+        </w:rPr>
+        <w:t xml:space="preserve">ZOHO </w:t>
+      </w:r>
+      <w:bookmarkStart w:id="0" w:name="_GoBack"/>
+      <w:bookmarkEnd w:id="0"/>
+      <w:r>
+        <w:rPr>
+          <w:rFonts w:ascii="Garamond" w:eastAsia="Times New Roman" w:hAnsi="Garamond" w:cs="Times New Roman"/>
+          <w:sz w:val="20"/>
+          <w:szCs w:val="20"/>
+          <w:lang w:val="en-IN" w:eastAsia="en-IN"/>
+        </w:rPr>
+        <w:t>is a Global SaaS company providing CRM, office suite, and business tools to 100M+ users across 180+ countries</w:t>
+      </w:r>
     </w:p>
     <w:p>
       <w:pPr>
@@ -933,34 +948,116 @@
       <w:r>
         <w:rPr>
           <w:rFonts w:ascii="Garamond" w:eastAsia="Times New Roman" w:hAnsi="Garamond" w:cs="Times New Roman"/>
-          <w:color w:val="000000"/>
-          <w:sz w:val="20"/>
-          <w:szCs w:val="20"/>
-          <w:lang w:val="en-IN" w:eastAsia="en-IN"/>
-        </w:rPr>
-        <w:t xml:space="preserve">Delivered and localized production UI for </w:t>
-      </w:r>
-      <w:proofErr w:type="spellStart"/>
-      <w:r>
-        <w:rPr>
-          <w:rFonts w:ascii="Garamond" w:eastAsia="Times New Roman" w:hAnsi="Garamond" w:cs="Times New Roman"/>
-          <w:color w:val="000000"/>
-          <w:sz w:val="20"/>
-          <w:szCs w:val="20"/>
-          <w:lang w:val="en-IN" w:eastAsia="en-IN"/>
-        </w:rPr>
-        <w:t>Zoho</w:t>
-      </w:r>
-      <w:proofErr w:type="spellEnd"/>
-      <w:r>
-        <w:rPr>
-          <w:rFonts w:ascii="Garamond" w:eastAsia="Times New Roman" w:hAnsi="Garamond" w:cs="Times New Roman"/>
-          <w:color w:val="000000"/>
-          <w:sz w:val="20"/>
-          <w:szCs w:val="20"/>
-          <w:lang w:val="en-IN" w:eastAsia="en-IN"/>
-        </w:rPr>
-        <w:t xml:space="preserve"> Japan products, supporting region-specific product adoption.</w:t>
+          <w:b/>
+          <w:color w:val="000000"/>
+          <w:sz w:val="20"/>
+          <w:szCs w:val="20"/>
+          <w:lang w:val="en-IN" w:eastAsia="en-IN"/>
+        </w:rPr>
+        <w:t xml:space="preserve">Key </w:t>
+      </w:r>
+      <w:r>
+        <w:rPr>
+          <w:rFonts w:ascii="Garamond" w:eastAsia="Times New Roman" w:hAnsi="Garamond" w:cs="Times New Roman"/>
+          <w:b/>
+          <w:color w:val="000000"/>
+          <w:sz w:val="20"/>
+          <w:szCs w:val="20"/>
+          <w:lang w:val="en-IN" w:eastAsia="en-IN"/>
+        </w:rPr>
+        <w:t>a</w:t>
+      </w:r>
+      <w:r>
+        <w:rPr>
+          <w:rFonts w:ascii="Garamond" w:eastAsia="Times New Roman" w:hAnsi="Garamond" w:cs="Times New Roman"/>
+          <w:b/>
+          <w:color w:val="000000"/>
+          <w:sz w:val="20"/>
+          <w:szCs w:val="20"/>
+          <w:lang w:val="en-IN" w:eastAsia="en-IN"/>
+        </w:rPr>
+        <w:t>chievement:</w:t>
+      </w:r>
+      <w:r>
+        <w:rPr>
+          <w:rFonts w:ascii="Garamond" w:eastAsia="Times New Roman" w:hAnsi="Garamond" w:cs="Times New Roman"/>
+          <w:color w:val="000000"/>
+          <w:sz w:val="20"/>
+          <w:szCs w:val="20"/>
+          <w:lang w:val="en-IN" w:eastAsia="en-IN"/>
+        </w:rPr>
+        <w:t xml:space="preserve"> </w:t>
+      </w:r>
+      <w:r>
+        <w:rPr>
+          <w:rFonts w:ascii="Garamond" w:eastAsia="Times New Roman" w:hAnsi="Garamond" w:cs="Times New Roman"/>
+          <w:color w:val="000000"/>
+          <w:sz w:val="20"/>
+          <w:szCs w:val="20"/>
+          <w:lang w:val="en-IN" w:eastAsia="en-IN"/>
+        </w:rPr>
+        <w:t xml:space="preserve">Owned frontend architecture for Japan CRM </w:t>
+      </w:r>
+      <w:r>
+        <w:rPr>
+          <w:rFonts w:ascii="Garamond" w:eastAsia="Times New Roman" w:hAnsi="Garamond" w:cs="Times New Roman"/>
+          <w:color w:val="000000"/>
+          <w:sz w:val="20"/>
+          <w:szCs w:val="20"/>
+          <w:lang w:val="en-IN" w:eastAsia="en-IN"/>
+        </w:rPr>
+        <w:t>Academy</w:t>
+      </w:r>
+      <w:r>
+        <w:rPr>
+          <w:rFonts w:ascii="Garamond" w:eastAsia="Times New Roman" w:hAnsi="Garamond" w:cs="Times New Roman"/>
+          <w:color w:val="000000"/>
+          <w:sz w:val="20"/>
+          <w:szCs w:val="20"/>
+          <w:lang w:val="en-IN" w:eastAsia="en-IN"/>
+        </w:rPr>
+        <w:t xml:space="preserve"> learning platform (</w:t>
+      </w:r>
+      <w:r>
+        <w:rPr>
+          <w:rFonts w:ascii="Garamond" w:eastAsia="Times New Roman" w:hAnsi="Garamond" w:cs="Times New Roman"/>
+          <w:bCs/>
+          <w:color w:val="000000"/>
+          <w:sz w:val="20"/>
+          <w:szCs w:val="20"/>
+          <w:lang w:val="en-IN" w:eastAsia="en-IN"/>
+        </w:rPr>
+        <w:t>5,000+ MAU</w:t>
+      </w:r>
+      <w:r>
+        <w:rPr>
+          <w:rFonts w:ascii="Garamond" w:eastAsia="Times New Roman" w:hAnsi="Garamond" w:cs="Times New Roman"/>
+          <w:color w:val="000000"/>
+          <w:sz w:val="20"/>
+          <w:szCs w:val="20"/>
+          <w:lang w:val="en-IN" w:eastAsia="en-IN"/>
+        </w:rPr>
+        <w:t>), improving</w:t>
+      </w:r>
+      <w:r>
+        <w:rPr>
+          <w:rFonts w:ascii="Garamond" w:eastAsia="Times New Roman" w:hAnsi="Garamond" w:cs="Times New Roman"/>
+          <w:color w:val="000000"/>
+          <w:sz w:val="20"/>
+          <w:szCs w:val="20"/>
+          <w:lang w:val="en-IN" w:eastAsia="en-IN"/>
+        </w:rPr>
+        <w:t xml:space="preserve"> signups by </w:t>
+      </w:r>
+      <w:r>
+        <w:rPr>
+          <w:rFonts w:ascii="Garamond" w:eastAsia="Times New Roman" w:hAnsi="Garamond" w:cs="Times New Roman"/>
+          <w:color w:val="000000"/>
+          <w:sz w:val="20"/>
+          <w:szCs w:val="20"/>
+          <w:lang w:val="en-IN" w:eastAsia="en-IN"/>
+        </w:rPr>
+        <w:t>~30%.</w:t>
       </w:r>
     </w:p>
     <w:p>
@@ -988,47 +1085,29 @@
           <w:szCs w:val="20"/>
           <w:lang w:val="en-IN" w:eastAsia="en-IN"/>
         </w:rPr>
-        <w:t xml:space="preserve">Owned frontend architecture for Japan CRM </w:t>
-      </w:r>
-      <w:r>
-        <w:rPr>
-          <w:rFonts w:ascii="Garamond" w:eastAsia="Times New Roman" w:hAnsi="Garamond" w:cs="Times New Roman"/>
-          <w:color w:val="000000"/>
-          <w:sz w:val="20"/>
-          <w:szCs w:val="20"/>
-          <w:lang w:val="en-IN" w:eastAsia="en-IN"/>
-        </w:rPr>
-        <w:t>Academy,</w:t>
-      </w:r>
-      <w:r>
-        <w:rPr>
-          <w:rFonts w:ascii="Garamond" w:eastAsia="Times New Roman" w:hAnsi="Garamond" w:cs="Times New Roman"/>
-          <w:color w:val="000000"/>
-          <w:sz w:val="20"/>
-          <w:szCs w:val="20"/>
-          <w:lang w:val="en-IN" w:eastAsia="en-IN"/>
-        </w:rPr>
-        <w:t xml:space="preserve"> </w:t>
-      </w:r>
-      <w:r>
-        <w:rPr>
-          <w:rFonts w:ascii="Garamond" w:eastAsia="Times New Roman" w:hAnsi="Garamond" w:cs="Times New Roman"/>
-          <w:color w:val="000000"/>
-          <w:sz w:val="20"/>
-          <w:szCs w:val="20"/>
-          <w:lang w:val="en-IN" w:eastAsia="en-IN"/>
-        </w:rPr>
-        <w:t xml:space="preserve">boosting signups by </w:t>
-      </w:r>
-      <w:r>
-        <w:rPr>
-          <w:rFonts w:ascii="Garamond" w:eastAsia="Times New Roman" w:hAnsi="Garamond" w:cs="Times New Roman"/>
-          <w:color w:val="000000"/>
-          <w:sz w:val="20"/>
-          <w:szCs w:val="20"/>
-          <w:lang w:val="en-IN" w:eastAsia="en-IN"/>
-        </w:rPr>
-        <w:t>~30%.</w:t>
+        <w:t xml:space="preserve">Delivered and localized production UI for </w:t>
+      </w:r>
+      <w:proofErr w:type="spellStart"/>
+      <w:r>
+        <w:rPr>
+          <w:rFonts w:ascii="Garamond" w:eastAsia="Times New Roman" w:hAnsi="Garamond" w:cs="Times New Roman"/>
+          <w:color w:val="000000"/>
+          <w:sz w:val="20"/>
+          <w:szCs w:val="20"/>
+          <w:lang w:val="en-IN" w:eastAsia="en-IN"/>
+        </w:rPr>
+        <w:t>Zoho</w:t>
+      </w:r>
+      <w:proofErr w:type="spellEnd"/>
+      <w:r>
+        <w:rPr>
+          <w:rFonts w:ascii="Garamond" w:eastAsia="Times New Roman" w:hAnsi="Garamond" w:cs="Times New Roman"/>
+          <w:color w:val="000000"/>
+          <w:sz w:val="20"/>
+          <w:szCs w:val="20"/>
+          <w:lang w:val="en-IN" w:eastAsia="en-IN"/>
+        </w:rPr>
+        <w:t xml:space="preserve"> Japan products, supporting region-specific product adoption.</w:t>
       </w:r>
     </w:p>
     <w:p>
@@ -1084,7 +1163,7 @@
           <w:szCs w:val="20"/>
           <w:lang w:val="en-IN" w:eastAsia="en-IN"/>
         </w:rPr>
-        <w:t>Implemented micro-frontend architectures, improving modular deployment and UI consistency.</w:t>
+        <w:t>Introduced AI-assisted HTML scaffolding, improving frontend development speed by ~50%.</w:t>
       </w:r>
     </w:p>
     <w:p>
@@ -1112,7 +1191,7 @@
           <w:szCs w:val="20"/>
           <w:lang w:val="en-IN" w:eastAsia="en-IN"/>
         </w:rPr>
-        <w:t>Introduced AI-assisted HTML scaffolding, improving frontend development speed by ~50%.</w:t>
+        <w:t>Built internal Chrome extensions for SEO audits, reducing manual QA effort by ~30%.</w:t>
       </w:r>
     </w:p>
     <w:p>
@@ -1140,7 +1219,7 @@
           <w:szCs w:val="20"/>
           <w:lang w:val="en-IN" w:eastAsia="en-IN"/>
         </w:rPr>
-        <w:t>Built internal Chrome extensions for SEO audits, reducing manual QA effort by ~30%.</w:t>
+        <w:t>Enabled RTL layout support and structured i18n for multilingual deployments.</w:t>
       </w:r>
     </w:p>
     <w:p>
@@ -1168,34 +1247,6 @@
           <w:szCs w:val="20"/>
           <w:lang w:val="en-IN" w:eastAsia="en-IN"/>
         </w:rPr>
-        <w:t>Enabled RTL layout support and structured i18n for multilingual deployments.</w:t>
-      </w:r>
-    </w:p>
-    <w:p>
-      <w:pPr>
-        <w:pStyle w:val="ListParagraph"/>
-        <w:numPr>
-          <w:ilvl w:val="0"/>
-          <w:numId w:val="28"/>
-        </w:numPr>
-        <w:spacing w:after="0"/>
-        <w:textAlignment w:val="baseline"/>
-        <w:rPr>
-          <w:rFonts w:ascii="Garamond" w:eastAsia="Times New Roman" w:hAnsi="Garamond" w:cs="Times New Roman"/>
-          <w:color w:val="000000"/>
-          <w:sz w:val="20"/>
-          <w:szCs w:val="20"/>
-          <w:lang w:val="en-IN" w:eastAsia="en-IN"/>
-        </w:rPr>
-      </w:pPr>
-      <w:r>
-        <w:rPr>
-          <w:rFonts w:ascii="Garamond" w:eastAsia="Times New Roman" w:hAnsi="Garamond" w:cs="Times New Roman"/>
-          <w:color w:val="000000"/>
-          <w:sz w:val="20"/>
-          <w:szCs w:val="20"/>
-          <w:lang w:val="en-IN" w:eastAsia="en-IN"/>
-        </w:rPr>
         <w:t xml:space="preserve">Contributed frontend execution for global events including </w:t>
       </w:r>
       <w:proofErr w:type="spellStart"/>
@@ -1820,7 +1871,7 @@
           <w:szCs w:val="20"/>
           <w:lang w:val="en-IN" w:eastAsia="en-IN"/>
         </w:rPr>
-        <w:t xml:space="preserve"> </w:t>
+        <w:t xml:space="preserve"> Chennai,</w:t>
       </w:r>
       <w:r>
         <w:rPr>
@@ -1834,7 +1885,6 @@
         </w:rPr>
         <w:t xml:space="preserve"> </w:t>
       </w:r>
-      <w:proofErr w:type="spellStart"/>
       <w:r>
         <w:rPr>
           <w:rFonts w:ascii="Garamond" w:eastAsia="Times New Roman" w:hAnsi="Garamond" w:cs="Times New Roman"/>
@@ -1845,23 +1895,8 @@
           <w:szCs w:val="20"/>
           <w:lang w:val="en-IN" w:eastAsia="en-IN"/>
         </w:rPr>
-        <w:t>Chennai</w:t>
-      </w:r>
-      <w:proofErr w:type="gramStart"/>
-      <w:r>
-        <w:rPr>
-          <w:rFonts w:ascii="Garamond" w:eastAsia="Times New Roman" w:hAnsi="Garamond" w:cs="Times New Roman"/>
-          <w:i/>
-          <w:iCs/>
-          <w:color w:val="000000"/>
-          <w:sz w:val="20"/>
-          <w:szCs w:val="20"/>
-          <w:lang w:val="en-IN" w:eastAsia="en-IN"/>
-        </w:rPr>
-        <w:t>,India</w:t>
-      </w:r>
-      <w:proofErr w:type="spellEnd"/>
-      <w:proofErr w:type="gramEnd"/>
+        <w:t>India</w:t>
+      </w:r>
     </w:p>
     <w:p>
       <w:pPr>
@@ -1922,8 +1957,6 @@
         </w:rPr>
         <w:t>-recognized website for UK client Bluestone98, enhancing client engagements.</w:t>
       </w:r>
-      <w:bookmarkStart w:id="0" w:name="_GoBack"/>
-      <w:bookmarkEnd w:id="0"/>
     </w:p>
     <w:p>
       <w:pPr>
@@ -2596,9 +2629,8 @@
           <w:szCs w:val="20"/>
           <w:lang w:val="en-IN" w:eastAsia="en-IN"/>
         </w:rPr>
-        <w:t xml:space="preserve">  </w:t>
-      </w:r>
-      <w:proofErr w:type="spellStart"/>
+        <w:t xml:space="preserve"> </w:t>
+      </w:r>
       <w:r>
         <w:rPr>
           <w:rFonts w:ascii="Garamond" w:eastAsia="Times New Roman" w:hAnsi="Garamond" w:cs="Times New Roman"/>
@@ -2609,9 +2641,8 @@
           <w:szCs w:val="20"/>
           <w:lang w:val="en-IN" w:eastAsia="en-IN"/>
         </w:rPr>
-        <w:t>Chennai</w:t>
-      </w:r>
-      <w:proofErr w:type="gramStart"/>
+        <w:t>Chennai,</w:t>
+      </w:r>
       <w:r>
         <w:rPr>
           <w:rFonts w:ascii="Garamond" w:eastAsia="Times New Roman" w:hAnsi="Garamond" w:cs="Times New Roman"/>
@@ -2622,10 +2653,20 @@
           <w:szCs w:val="20"/>
           <w:lang w:val="en-IN" w:eastAsia="en-IN"/>
         </w:rPr>
-        <w:t>,India</w:t>
-      </w:r>
-      <w:proofErr w:type="spellEnd"/>
-      <w:proofErr w:type="gramEnd"/>
+        <w:t xml:space="preserve"> </w:t>
+      </w:r>
+      <w:r>
+        <w:rPr>
+          <w:rFonts w:ascii="Garamond" w:eastAsia="Times New Roman" w:hAnsi="Garamond" w:cs="Times New Roman"/>
+          <w:i/>
+          <w:iCs/>
+          <w:color w:val="000000"/>
+          <w:sz w:val="20"/>
+          <w:szCs w:val="20"/>
+          <w:lang w:val="en-IN" w:eastAsia="en-IN"/>
+        </w:rPr>
+        <w:t>India</w:t>
+      </w:r>
     </w:p>
     <w:p>
       <w:pPr>
@@ -2917,7 +2958,16 @@
           <w:szCs w:val="20"/>
           <w:lang w:val="en-IN" w:eastAsia="en-IN"/>
         </w:rPr>
-        <w:t>), AI-driven Code Generation (Cursor), Chrome Extension Development, Automated UI Scaffolding.</w:t>
+        <w:t>), AI-driven Code Generation (Cursor), Chrome Extension Develo</w:t>
+      </w:r>
+      <w:r>
+        <w:rPr>
+          <w:rFonts w:ascii="Garamond" w:eastAsia="Times New Roman" w:hAnsi="Garamond" w:cs="Times New Roman"/>
+          <w:sz w:val="20"/>
+          <w:szCs w:val="20"/>
+          <w:lang w:val="en-IN" w:eastAsia="en-IN"/>
+        </w:rPr>
+        <w:t>pment, Automated UI Scaffolding and testing</w:t>
       </w:r>
     </w:p>
     <w:p>
@@ -2952,7 +3002,25 @@
           <w:szCs w:val="20"/>
           <w:lang w:val="en-IN" w:eastAsia="en-IN"/>
         </w:rPr>
-        <w:t xml:space="preserve"> Component-Driven UI, Micro Frontends, Web Components, i18n, RTL</w:t>
+        <w:t xml:space="preserve"> Component-Driven </w:t>
+      </w:r>
+      <w:r>
+        <w:rPr>
+          <w:rFonts w:ascii="Garamond" w:eastAsia="Times New Roman" w:hAnsi="Garamond" w:cs="Times New Roman"/>
+          <w:sz w:val="20"/>
+          <w:szCs w:val="20"/>
+          <w:lang w:val="en-IN" w:eastAsia="en-IN"/>
+        </w:rPr>
+        <w:t>development</w:t>
+      </w:r>
+      <w:r>
+        <w:rPr>
+          <w:rFonts w:ascii="Garamond" w:eastAsia="Times New Roman" w:hAnsi="Garamond" w:cs="Times New Roman"/>
+          <w:sz w:val="20"/>
+          <w:szCs w:val="20"/>
+          <w:lang w:val="en-IN" w:eastAsia="en-IN"/>
+        </w:rPr>
+        <w:t>, Micro Frontends, Web Components, i18n, RTL</w:t>
       </w:r>
     </w:p>
     <w:p>
@@ -3190,9 +3258,8 @@
           <w:szCs w:val="20"/>
           <w:lang w:val="en-IN" w:eastAsia="en-IN"/>
         </w:rPr>
-        <w:t xml:space="preserve">Built and localized a production learning platform for </w:t>
-      </w:r>
-      <w:proofErr w:type="spellStart"/>
+        <w:t>Built and localized a production le</w:t>
+      </w:r>
       <w:r>
         <w:rPr>
           <w:rFonts w:ascii="Garamond" w:eastAsia="Times New Roman" w:hAnsi="Garamond" w:cs="Times New Roman"/>
@@ -3202,9 +3269,38 @@
           <w:szCs w:val="20"/>
           <w:lang w:val="en-IN" w:eastAsia="en-IN"/>
         </w:rPr>
-        <w:t>Zoho</w:t>
-      </w:r>
-      <w:proofErr w:type="spellEnd"/>
+        <w:t xml:space="preserve">arning platform for </w:t>
+      </w:r>
+      <w:r>
+        <w:rPr>
+          <w:rFonts w:ascii="Garamond" w:eastAsia="Times New Roman" w:hAnsi="Garamond" w:cs="Times New Roman"/>
+          <w:color w:val="000000"/>
+          <w:sz w:val="20"/>
+          <w:szCs w:val="20"/>
+          <w:lang w:val="en-IN" w:eastAsia="en-IN"/>
+        </w:rPr>
+        <w:t xml:space="preserve">Japan CRM </w:t>
+      </w:r>
+      <w:r>
+        <w:rPr>
+          <w:rFonts w:ascii="Garamond" w:eastAsia="Times New Roman" w:hAnsi="Garamond" w:cs="Times New Roman"/>
+          <w:color w:val="000000"/>
+          <w:sz w:val="20"/>
+          <w:szCs w:val="20"/>
+          <w:lang w:val="en-IN" w:eastAsia="en-IN"/>
+        </w:rPr>
+        <w:t>product</w:t>
+      </w:r>
+      <w:r>
+        <w:rPr>
+          <w:rFonts w:ascii="Garamond" w:eastAsia="Times New Roman" w:hAnsi="Garamond" w:cs="Times New Roman"/>
+          <w:color w:val="000000"/>
+          <w:sz w:val="20"/>
+          <w:szCs w:val="20"/>
+          <w:lang w:val="en-IN" w:eastAsia="en-IN"/>
+        </w:rPr>
+        <w:t xml:space="preserve"> </w:t>
+      </w:r>
       <w:r>
         <w:rPr>
           <w:rFonts w:ascii="Garamond" w:eastAsia="Times New Roman" w:hAnsi="Garamond" w:cs="Times New Roman"/>
@@ -3214,7 +3310,29 @@
           <w:szCs w:val="20"/>
           <w:lang w:val="en-IN" w:eastAsia="en-IN"/>
         </w:rPr>
-        <w:t xml:space="preserve"> Japan, supporting 5,000+ MAU and increasing CRM sign-up conversion by ~30%. (</w:t>
+        <w:t xml:space="preserve">and increasing </w:t>
+      </w:r>
+      <w:r>
+        <w:rPr>
+          <w:rFonts w:ascii="Garamond" w:eastAsia="Times New Roman" w:hAnsi="Garamond" w:cs="Times New Roman"/>
+          <w:bCs/>
+          <w:color w:val="000000"/>
+          <w:sz w:val="20"/>
+          <w:szCs w:val="20"/>
+          <w:lang w:val="en-IN" w:eastAsia="en-IN"/>
+        </w:rPr>
+        <w:t xml:space="preserve">Japan </w:t>
+      </w:r>
+      <w:r>
+        <w:rPr>
+          <w:rFonts w:ascii="Garamond" w:eastAsia="Times New Roman" w:hAnsi="Garamond" w:cs="Times New Roman"/>
+          <w:bCs/>
+          <w:color w:val="000000"/>
+          <w:sz w:val="20"/>
+          <w:szCs w:val="20"/>
+          <w:lang w:val="en-IN" w:eastAsia="en-IN"/>
+        </w:rPr>
+        <w:t>CRM sign-up conversion by ~30%. (</w:t>
       </w:r>
       <w:r>
         <w:rPr>
@@ -3239,19 +3357,6 @@
         </w:rPr>
         <w:t>: JavaScript, SCSS, REST APIs, i18n)</w:t>
       </w:r>
-    </w:p>
-    <w:p>
-      <w:pPr>
-        <w:spacing w:after="0"/>
-        <w:rPr>
-          <w:rFonts w:ascii="Garamond" w:eastAsia="Times New Roman" w:hAnsi="Garamond" w:cs="Times New Roman"/>
-          <w:bCs/>
-          <w:color w:val="000000"/>
-          <w:sz w:val="20"/>
-          <w:szCs w:val="20"/>
-          <w:lang w:val="en-IN" w:eastAsia="en-IN"/>
-        </w:rPr>
-      </w:pPr>
     </w:p>
     <w:p>
       <w:pPr>
@@ -3726,9 +3831,8 @@
           <w:lang w:val="en-IN" w:eastAsia="en-IN"/>
         </w:rPr>
         <w:tab/>
-        <w:t xml:space="preserve">          </w:t>
-      </w:r>
-      <w:proofErr w:type="spellStart"/>
+        <w:t xml:space="preserve">         </w:t>
+      </w:r>
       <w:r>
         <w:rPr>
           <w:rFonts w:ascii="Garamond" w:eastAsia="Times New Roman" w:hAnsi="Garamond" w:cs="Times New Roman"/>
@@ -3739,9 +3843,8 @@
           <w:szCs w:val="20"/>
           <w:lang w:val="en-IN" w:eastAsia="en-IN"/>
         </w:rPr>
-        <w:t>Chennai</w:t>
-      </w:r>
-      <w:proofErr w:type="gramStart"/>
+        <w:t>Chennai,</w:t>
+      </w:r>
       <w:r>
         <w:rPr>
           <w:rFonts w:ascii="Garamond" w:eastAsia="Times New Roman" w:hAnsi="Garamond" w:cs="Times New Roman"/>
@@ -3752,10 +3855,20 @@
           <w:szCs w:val="20"/>
           <w:lang w:val="en-IN" w:eastAsia="en-IN"/>
         </w:rPr>
-        <w:t>,India</w:t>
-      </w:r>
-      <w:proofErr w:type="spellEnd"/>
-      <w:proofErr w:type="gramEnd"/>
+        <w:t xml:space="preserve"> </w:t>
+      </w:r>
+      <w:r>
+        <w:rPr>
+          <w:rFonts w:ascii="Garamond" w:eastAsia="Times New Roman" w:hAnsi="Garamond" w:cs="Times New Roman"/>
+          <w:i/>
+          <w:iCs/>
+          <w:color w:val="000000"/>
+          <w:sz w:val="20"/>
+          <w:szCs w:val="20"/>
+          <w:lang w:val="en-IN" w:eastAsia="en-IN"/>
+        </w:rPr>
+        <w:t>India</w:t>
+      </w:r>
     </w:p>
     <w:p>
       <w:pPr>
@@ -3922,6 +4035,7 @@
         </w:rPr>
         <w:t xml:space="preserve">PC building, </w:t>
       </w:r>
+      <w:proofErr w:type="gramStart"/>
       <w:r>
         <w:rPr>
           <w:rFonts w:ascii="Garamond" w:eastAsia="Times New Roman" w:hAnsi="Garamond" w:cs="Times New Roman"/>
@@ -3933,6 +4047,7 @@
         </w:rPr>
         <w:t>Travelling</w:t>
       </w:r>
+      <w:proofErr w:type="gramEnd"/>
       <w:r>
         <w:rPr>
           <w:rFonts w:ascii="Garamond" w:eastAsia="Times New Roman" w:hAnsi="Garamond" w:cs="Times New Roman"/>
@@ -3947,7 +4062,7 @@
     </w:p>
     <w:sectPr>
       <w:pgSz w:w="12240" w:h="15840"/>
-      <w:pgMar w:top="227" w:right="284" w:bottom="227" w:left="284" w:header="720" w:footer="720" w:gutter="0"/>
+      <w:pgMar w:top="113" w:right="284" w:bottom="113" w:left="284" w:header="720" w:footer="720" w:gutter="0"/>
       <w:cols w:space="720"/>
       <w:docGrid w:linePitch="360"/>
     </w:sectPr>
@@ -18747,7 +18862,7 @@
 </file>
 
 <file path=customXml/itemProps1.xml><?xml version="1.0" encoding="utf-8"?>
-<ds:datastoreItem xmlns:ds="http://schemas.openxmlformats.org/officeDocument/2006/customXml" ds:itemID="{CAB449C4-E72C-40FD-8F98-79C9DCB673CC}">
+<ds:datastoreItem xmlns:ds="http://schemas.openxmlformats.org/officeDocument/2006/customXml" ds:itemID="{DE967DB4-B3D8-497B-905A-E661A44D2BE3}">
   <ds:schemaRefs>
     <ds:schemaRef ds:uri="http://schemas.openxmlformats.org/officeDocument/2006/bibliography"/>
   </ds:schemaRefs>

</xml_diff>